<commit_message>
docs: cập nhật đặc tả kỹ thuật Expo + Skia và thêm script tạo cấu trúc
</commit_message>
<xml_diff>
--- a/docs/technical/Kế hoạch và đặc tả cho đội dev.docx
+++ b/docs/technical/Kế hoạch và đặc tả cho đội dev.docx
@@ -19,7 +19,16 @@
         <w:t xml:space="preserve">Dùng tài liệu này:</w:t>
       </w:r>
       <w:r>
-        <w:t xml:space="preserve"> tab “Báo cáo ý tưởng” giải thích sản phẩm cho người đọc không chuyên kỹ thuật; tab này dành cho đội dev. Bắt đầu từ mục 19 (tuần đầu tiên) rồi theo kế hoạch ở mục 13.</w:t>
+        <w:t xml:space="preserve"> tab “Báo cáo ý tưởng” giải thích sản phẩm cho người đọc không chuyên kỹ thuật; tab này dành cho đội dev. Công nghệ là </w:t>
+      </w:r>
+      <w:r>
+        <w:rPr>
+          <w:b/>
+        </w:rPr>
+        <w:t xml:space="preserve">Expo (React Native) + Firebase</w:t>
+      </w:r>
+      <w:r>
+        <w:t xml:space="preserve">; các chỗ còn nhắc Flutter đọc theo bảng đối chiếu ở mục 8. Bắt đầu từ mục 19 (tuần đầu tiên) rồi theo kế hoạch ở mục 13.</w:t>
       </w:r>
     </w:p>
     <w:p>
@@ -3990,8 +3999,8 @@
         <w:tblLook w:val="04A0" w:firstRow="1" w:lastRow="0" w:firstColumn="0" w:lastColumn="0" w:noHBand="0" w:noVBand="1"/>
       </w:tblPr>
       <w:tblGrid>
-        <w:gridCol w:w="3003"/>
-        <w:gridCol w:w="6356"/>
+        <w:gridCol w:w="4207"/>
+        <w:gridCol w:w="5152"/>
       </w:tblGrid>
       <w:tr>
         <w:trPr>
@@ -3999,7 +4008,7 @@
         </w:trPr>
         <w:tc>
           <w:tcPr>
-            <w:tcW w:w="3003" w:type="dxa"/>
+            <w:tcW w:w="4207" w:type="dxa"/>
             <w:shd w:val="clear" w:color="auto" w:fill="F2F2F2"/>
           </w:tcPr>
           <w:p>
@@ -4011,7 +4020,7 @@
         </w:tc>
         <w:tc>
           <w:tcPr>
-            <w:tcW w:w="6356" w:type="dxa"/>
+            <w:tcW w:w="5152" w:type="dxa"/>
             <w:shd w:val="clear" w:color="auto" w:fill="F2F2F2"/>
           </w:tcPr>
           <w:p>
@@ -4025,7 +4034,7 @@
       <w:tr>
         <w:tc>
           <w:tcPr>
-            <w:tcW w:w="3003" w:type="dxa"/>
+            <w:tcW w:w="4207" w:type="dxa"/>
           </w:tcPr>
           <w:p>
             <w:pPr/>
@@ -4036,44 +4045,20 @@
         </w:tc>
         <w:tc>
           <w:tcPr>
-            <w:tcW w:w="6356" w:type="dxa"/>
-          </w:tcPr>
-          <w:p>
-            <w:pPr/>
-            <w:r>
-              <w:t xml:space="preserve">Flutter (Dart), Android minSdk 24, iOS 15+</w:t>
-            </w:r>
-          </w:p>
-        </w:tc>
-      </w:tr>
-      <w:tr>
-        <w:tc>
-          <w:tcPr>
-            <w:tcW w:w="3003" w:type="dxa"/>
-          </w:tcPr>
-          <w:p>
-            <w:pPr/>
-            <w:r>
-              <w:t xml:space="preserve">Quản lý trạng thái</w:t>
-            </w:r>
-          </w:p>
-        </w:tc>
-        <w:tc>
-          <w:tcPr>
-            <w:tcW w:w="6356" w:type="dxa"/>
-          </w:tcPr>
-          <w:p>
-            <w:pPr/>
-            <w:r>
-              <w:t xml:space="preserve">Riverpod</w:t>
-            </w:r>
-          </w:p>
-        </w:tc>
-      </w:tr>
-      <w:tr>
-        <w:tc>
-          <w:tcPr>
-            <w:tcW w:w="3003" w:type="dxa"/>
+            <w:tcW w:w="5152" w:type="dxa"/>
+          </w:tcPr>
+          <w:p>
+            <w:pPr/>
+            <w:r>
+              <w:t xml:space="preserve">Expo (React Native) + TypeScript; iOS 15+, Android minSdk 24. Dùng development build (không dùng Expo Go cho widget, thông báo đẩy và Firebase gốc)</w:t>
+            </w:r>
+          </w:p>
+        </w:tc>
+      </w:tr>
+      <w:tr>
+        <w:tc>
+          <w:tcPr>
+            <w:tcW w:w="4207" w:type="dxa"/>
           </w:tcPr>
           <w:p>
             <w:pPr/>
@@ -4084,20 +4069,44 @@
         </w:tc>
         <w:tc>
           <w:tcPr>
-            <w:tcW w:w="6356" w:type="dxa"/>
-          </w:tcPr>
-          <w:p>
-            <w:pPr/>
-            <w:r>
-              <w:t xml:space="preserve">go_router</w:t>
-            </w:r>
-          </w:p>
-        </w:tc>
-      </w:tr>
-      <w:tr>
-        <w:tc>
-          <w:tcPr>
-            <w:tcW w:w="3003" w:type="dxa"/>
+            <w:tcW w:w="5152" w:type="dxa"/>
+          </w:tcPr>
+          <w:p>
+            <w:pPr/>
+            <w:r>
+              <w:t xml:space="preserve">Expo Router</w:t>
+            </w:r>
+          </w:p>
+        </w:tc>
+      </w:tr>
+      <w:tr>
+        <w:tc>
+          <w:tcPr>
+            <w:tcW w:w="4207" w:type="dxa"/>
+          </w:tcPr>
+          <w:p>
+            <w:pPr/>
+            <w:r>
+              <w:t xml:space="preserve">Dữ liệu và trạng thái</w:t>
+            </w:r>
+          </w:p>
+        </w:tc>
+        <w:tc>
+          <w:tcPr>
+            <w:tcW w:w="5152" w:type="dxa"/>
+          </w:tcPr>
+          <w:p>
+            <w:pPr/>
+            <w:r>
+              <w:t xml:space="preserve">TanStack Query cho dữ liệu từ máy chủ, Zustand cho trạng thái giao diện</w:t>
+            </w:r>
+          </w:p>
+        </w:tc>
+      </w:tr>
+      <w:tr>
+        <w:tc>
+          <w:tcPr>
+            <w:tcW w:w="4207" w:type="dxa"/>
           </w:tcPr>
           <w:p>
             <w:pPr/>
@@ -4108,20 +4117,20 @@
         </w:tc>
         <w:tc>
           <w:tcPr>
-            <w:tcW w:w="6356" w:type="dxa"/>
-          </w:tcPr>
-          <w:p>
-            <w:pPr/>
-            <w:r>
-              <w:t xml:space="preserve">Firebase: Auth, Firestore, Storage, Cloud Functions (TypeScript), Cloud Messaging, Remote Config, Analytics, Crashlytics</w:t>
-            </w:r>
-          </w:p>
-        </w:tc>
-      </w:tr>
-      <w:tr>
-        <w:tc>
-          <w:tcPr>
-            <w:tcW w:w="3003" w:type="dxa"/>
+            <w:tcW w:w="5152" w:type="dxa"/>
+          </w:tcPr>
+          <w:p>
+            <w:pPr/>
+            <w:r>
+              <w:t xml:space="preserve">Firebase (Auth, Firestore, Storage, Cloud Functions TypeScript, Cloud Messaging, Remote Config, Analytics, Crashlytics) qua @react-native-firebase</w:t>
+            </w:r>
+          </w:p>
+        </w:tc>
+      </w:tr>
+      <w:tr>
+        <w:tc>
+          <w:tcPr>
+            <w:tcW w:w="4207" w:type="dxa"/>
           </w:tcPr>
           <w:p>
             <w:pPr/>
@@ -4132,20 +4141,20 @@
         </w:tc>
         <w:tc>
           <w:tcPr>
-            <w:tcW w:w="6356" w:type="dxa"/>
-          </w:tcPr>
-          <w:p>
-            <w:pPr/>
-            <w:r>
-              <w:t xml:space="preserve">dart:ui Canvas trên thiết bị</w:t>
-            </w:r>
-          </w:p>
-        </w:tc>
-      </w:tr>
-      <w:tr>
-        <w:tc>
-          <w:tcPr>
-            <w:tcW w:w="3003" w:type="dxa"/>
+            <w:tcW w:w="5152" w:type="dxa"/>
+          </w:tcPr>
+          <w:p>
+            <w:pPr/>
+            <w:r>
+              <w:t xml:space="preserve">@shopify/react-native-skia, vẽ theo lớp trên thiết bị</w:t>
+            </w:r>
+          </w:p>
+        </w:tc>
+      </w:tr>
+      <w:tr>
+        <w:tc>
+          <w:tcPr>
+            <w:tcW w:w="4207" w:type="dxa"/>
           </w:tcPr>
           <w:p>
             <w:pPr/>
@@ -4156,36 +4165,84 @@
         </w:tc>
         <w:tc>
           <w:tcPr>
-            <w:tcW w:w="6356" w:type="dxa"/>
-          </w:tcPr>
-          <w:p>
-            <w:pPr/>
-            <w:r>
-              <w:t xml:space="preserve">Swift (WidgetKit) + home_widget</w:t>
-            </w:r>
-          </w:p>
-        </w:tc>
-      </w:tr>
-      <w:tr>
-        <w:tc>
-          <w:tcPr>
-            <w:tcW w:w="3003" w:type="dxa"/>
-          </w:tcPr>
-          <w:p>
-            <w:pPr/>
-            <w:r>
-              <w:t xml:space="preserve">CI/CD</w:t>
-            </w:r>
-          </w:p>
-        </w:tc>
-        <w:tc>
-          <w:tcPr>
-            <w:tcW w:w="6356" w:type="dxa"/>
-          </w:tcPr>
-          <w:p>
-            <w:pPr/>
-            <w:r>
-              <w:t xml:space="preserve">GitHub Actions (kiểm tra), Codemagic (build iOS và TestFlight trước; build Android ở Sprint 10)</w:t>
+            <w:tcW w:w="5152" w:type="dxa"/>
+          </w:tcPr>
+          <w:p>
+            <w:pPr/>
+            <w:r>
+              <w:t xml:space="preserve">Swift (WidgetKit) thêm bằng thư viện như @bacons/apple-targets, dùng chung App Group. Cần kiểm tra thư viện còn hoạt động với phiên bản Expo đang dùng</w:t>
+            </w:r>
+          </w:p>
+        </w:tc>
+      </w:tr>
+      <w:tr>
+        <w:tc>
+          <w:tcPr>
+            <w:tcW w:w="4207" w:type="dxa"/>
+          </w:tcPr>
+          <w:p>
+            <w:pPr/>
+            <w:r>
+              <w:t xml:space="preserve">Widget Android</w:t>
+            </w:r>
+          </w:p>
+        </w:tc>
+        <w:tc>
+          <w:tcPr>
+            <w:tcW w:w="5152" w:type="dxa"/>
+          </w:tcPr>
+          <w:p>
+            <w:pPr/>
+            <w:r>
+              <w:t xml:space="preserve">Kotlin native (làm ở bản Android)</w:t>
+            </w:r>
+          </w:p>
+        </w:tc>
+      </w:tr>
+      <w:tr>
+        <w:tc>
+          <w:tcPr>
+            <w:tcW w:w="4207" w:type="dxa"/>
+          </w:tcPr>
+          <w:p>
+            <w:pPr/>
+            <w:r>
+              <w:t xml:space="preserve">Build và phát hành</w:t>
+            </w:r>
+          </w:p>
+        </w:tc>
+        <w:tc>
+          <w:tcPr>
+            <w:tcW w:w="5152" w:type="dxa"/>
+          </w:tcPr>
+          <w:p>
+            <w:pPr/>
+            <w:r>
+              <w:t xml:space="preserve">EAS Build, EAS Submit (chạy trên cloud, không cần Mac để build); GitHub Actions cho kiểm tra</w:t>
+            </w:r>
+          </w:p>
+        </w:tc>
+      </w:tr>
+      <w:tr>
+        <w:tc>
+          <w:tcPr>
+            <w:tcW w:w="4207" w:type="dxa"/>
+          </w:tcPr>
+          <w:p>
+            <w:pPr/>
+            <w:r>
+              <w:t xml:space="preserve">Thử trên iPhone khi dùng Windows</w:t>
+            </w:r>
+          </w:p>
+        </w:tc>
+        <w:tc>
+          <w:tcPr>
+            <w:tcW w:w="5152" w:type="dxa"/>
+          </w:tcPr>
+          <w:p>
+            <w:pPr/>
+            <w:r>
+              <w:t xml:space="preserve">Development build cài qua EAS (internal distribution) hoặc TestFlight</w:t>
             </w:r>
           </w:p>
         </w:tc>
@@ -4212,7 +4269,7 @@
         <w:t xml:space="preserve">Package đề xuất:</w:t>
       </w:r>
       <w:r>
-        <w:t xml:space="preserve"> camera, gal, path_provider, permission_handler, firebase_core, firebase_auth, cloud_firestore, firebase_storage, cloud_functions, firebase_messaging, firebase_analytics, firebase_crashlytics, flutter_riverpod, go_router, audioplayers, share_plus, qr_flutter, mobile_scanner, image, cached_network_image, home_widget, sign_in_with_apple, google_sign_in. Team kiểm tra phiên bản và mức tương thích khi cài.</w:t>
+        <w:t xml:space="preserve"> expo-router, expo-dev-client, expo-camera (gồm quét QR), expo-image-picker, expo-image-manipulator, expo-media-library, expo-haptics, expo-audio, expo-sharing, expo-font, expo-localization, expo-apple-authentication, @react-native-firebase (app, auth, firestore, storage, functions, messaging, analytics, crashlytics), @shopify/react-native-skia, react-native-reanimated, react-native-gesture-handler, react-native-qrcode-svg, @tanstack/react-query, zustand. Ghi dữ liệu vào App Group cho widget cần một module native nhỏ hoặc thư viện như react-native-shared-group-preferences. Team kiểm tra phiên bản và mức tương thích với phiên bản Expo SDK khi cài.</w:t>
       </w:r>
     </w:p>
     <w:p>
@@ -4231,41 +4288,49 @@
       <w:bookmarkStart w:id="1" w:name="bongo_lang_text_1"/>
       <w:bookmarkEnd w:id="1"/>
       <w:r>
-        <w:t xml:space="preserve">lib/</w:t>
+        <w:t xml:space="preserve">mobile/</w:t>
         <w:br/>
-        <w:t xml:space="preserve">  core/          # theme, router, utils, constants</w:t>
+        <w:t xml:space="preserve">  app/              # Expo Router: màn hình theo đường dẫn</w:t>
         <w:br/>
-        <w:t xml:space="preserve">  data/          # repositories, models, services Firebase</w:t>
+        <w:t xml:space="preserve">    (tabs)/         # Khoảnh khắc, Garden, Booth, Cá nhân</w:t>
         <w:br/>
-        <w:t xml:space="preserve">  features/</w:t>
+        <w:t xml:space="preserve">  src/</w:t>
         <w:br/>
-        <w:t xml:space="preserve">    auth/        # M1</w:t>
+        <w:t xml:space="preserve">    core/           # theme (design token), utils, constants, components dùng chung</w:t>
         <w:br/>
-        <w:t xml:space="preserve">    friends/     # M2</w:t>
+        <w:t xml:space="preserve">    data/           # models, repositories, services Firebase</w:t>
         <w:br/>
-        <w:t xml:space="preserve">    moments/     # M3: Plant, Pick</w:t>
+        <w:t xml:space="preserve">    features/</w:t>
         <w:br/>
-        <w:t xml:space="preserve">    booth/       # M5: camera, state machine, review</w:t>
+        <w:t xml:space="preserve">      onboarding/   # giới thiệu 3 trang</w:t>
         <w:br/>
-        <w:t xml:space="preserve">    backdrop/    # M6: config, repository, composer</w:t>
+        <w:t xml:space="preserve">      auth/         # M1</w:t>
         <w:br/>
-        <w:t xml:space="preserve">    garden/      # M7, M8: sự kiện, album, sheet</w:t>
+        <w:t xml:space="preserve">      friends/      # M2</w:t>
         <w:br/>
-        <w:t xml:space="preserve">    safety/      # M9: report, block, delete account</w:t>
+        <w:t xml:space="preserve">      moments/      # M3: Plant, Pick</w:t>
         <w:br/>
-        <w:t xml:space="preserve">    settings/    # M10</w:t>
+        <w:t xml:space="preserve">      booth/        # M5: camera, state machine, review</w:t>
         <w:br/>
-        <w:t xml:space="preserve">  main_dev.dart</w:t>
+        <w:t xml:space="preserve">      backdrop/     # M6: cấu hình, composer Skia dạng lớp</w:t>
         <w:br/>
-        <w:t xml:space="preserve">  main_prod.dart</w:t>
+        <w:t xml:space="preserve">      garden/       # M7, M8: sự kiện, album, sheet</w:t>
         <w:br/>
-        <w:t xml:space="preserve">ios/LeafyWidget/   # M4: widget iOS (Swift, WidgetKit)</w:t>
+        <w:t xml:space="preserve">      safety/       # M9: báo cáo, chặn, xóa tài khoản</w:t>
         <w:br/>
-        <w:t xml:space="preserve">assets/</w:t>
+        <w:t xml:space="preserve">      settings/     # M10</w:t>
         <w:br/>
-        <w:t xml:space="preserve">  backdrops/ (json, ảnh nền)  stickers/  fonts/  sounds/</w:t>
+        <w:t xml:space="preserve">      frame_studio/ # M11 (bản 1.1)</w:t>
         <w:br/>
-        <w:t xml:space="preserve">functions/       # Cloud Functions TypeScript</w:t>
+        <w:t xml:space="preserve">      trending/     # M12 (bản 1.1)</w:t>
+        <w:br/>
+        <w:t xml:space="preserve">  targets/widget/   # M4: widget iOS (Swift, WidgetKit)</w:t>
+        <w:br/>
+        <w:t xml:space="preserve">  assets/           # backdrops, stickers, fonts, sounds, images</w:t>
+        <w:br/>
+        <w:t xml:space="preserve">  tests/            # unit, fixtures</w:t>
+        <w:br/>
+        <w:t xml:space="preserve">functions/          # Cloud Functions TypeScript</w:t>
       </w:r>
     </w:p>
     <w:p>
@@ -4277,18 +4342,284 @@
         <w:rPr>
           <w:b/>
         </w:rPr>
-        <w:t xml:space="preserve">flavor dev/prod</w:t>
-      </w:r>
-      <w:r>
-        <w:t xml:space="preserve"> với hai project Firebase riêng.</w:t>
+        <w:t xml:space="preserve">hai môi trường dev và prod</w:t>
+      </w:r>
+      <w:r>
+        <w:t xml:space="preserve"> với hai project Firebase riêng: chọn bằng biến APP_ENV và các profile của EAS (development, preview, production), mỗi môi trường có tệp cấu hình Firebase iOS và Android riêng.</w:t>
       </w:r>
     </w:p>
     <w:p>
       <w:pPr/>
       <w:r>
-        <w:t xml:space="preserve">Script create-leafybooth-structure.ps1 tạo sẵn cấu trúc thư mục này, thêm features/onboarding, features/frame_studio (M11, bản 1.1) và features/trending (M12, bản 1.1), cùng các thư mục docs/, design/, firebase/, scripts/ và .github/workflows/ ở gốc dự án.</w:t>
-      </w:r>
-    </w:p>
+        <w:t xml:space="preserve">Script create-leafybooth-structure.ps1 tạo sẵn cấu trúc thư mục này (cùng docs/, design/, firebase/, functions/, scripts/ và .github/workflows/ ở gốc dự án).</w:t>
+      </w:r>
+    </w:p>
+    <w:p>
+      <w:pPr/>
+      <w:r>
+        <w:rPr>
+          <w:b/>
+        </w:rPr>
+        <w:t xml:space="preserve">Bảng đối chiếu: các chỗ nhắc Flutter trong tài liệu đọc theo bảng này</w:t>
+      </w:r>
+    </w:p>
+    <w:tbl>
+      <w:tblPr>
+        <w:tblStyle w:val="TableGrid"/>
+        <w:tblW w:w="0" w:type="auto"/>
+        <w:tblLayout w:type="fixed"/>
+        <w:tblLook w:val="04A0" w:firstRow="1" w:lastRow="0" w:firstColumn="0" w:lastColumn="0" w:noHBand="0" w:noVBand="1"/>
+      </w:tblPr>
+      <w:tblGrid>
+        <w:gridCol w:w="3836"/>
+        <w:gridCol w:w="5523"/>
+      </w:tblGrid>
+      <w:tr>
+        <w:trPr>
+          <w:tblHeader/>
+        </w:trPr>
+        <w:tc>
+          <w:tcPr>
+            <w:tcW w:w="3836" w:type="dxa"/>
+            <w:shd w:val="clear" w:color="auto" w:fill="F2F2F2"/>
+          </w:tcPr>
+          <w:p>
+            <w:pPr/>
+            <w:r>
+              <w:t xml:space="preserve">Trong tài liệu</w:t>
+            </w:r>
+          </w:p>
+        </w:tc>
+        <w:tc>
+          <w:tcPr>
+            <w:tcW w:w="5523" w:type="dxa"/>
+            <w:shd w:val="clear" w:color="auto" w:fill="F2F2F2"/>
+          </w:tcPr>
+          <w:p>
+            <w:pPr/>
+            <w:r>
+              <w:t xml:space="preserve">Dùng với Expo</w:t>
+            </w:r>
+          </w:p>
+        </w:tc>
+      </w:tr>
+      <w:tr>
+        <w:tc>
+          <w:tcPr>
+            <w:tcW w:w="3836" w:type="dxa"/>
+          </w:tcPr>
+          <w:p>
+            <w:pPr/>
+            <w:r>
+              <w:t xml:space="preserve">Flutter lead, Flutter dev</w:t>
+            </w:r>
+          </w:p>
+        </w:tc>
+        <w:tc>
+          <w:tcPr>
+            <w:tcW w:w="5523" w:type="dxa"/>
+          </w:tcPr>
+          <w:p>
+            <w:pPr/>
+            <w:r>
+              <w:t xml:space="preserve">Mobile lead, Mobile dev (React Native)</w:t>
+            </w:r>
+          </w:p>
+        </w:tc>
+      </w:tr>
+      <w:tr>
+        <w:tc>
+          <w:tcPr>
+            <w:tcW w:w="3836" w:type="dxa"/>
+          </w:tcPr>
+          <w:p>
+            <w:pPr/>
+            <w:r>
+              <w:t xml:space="preserve">Package camera</w:t>
+            </w:r>
+          </w:p>
+        </w:tc>
+        <w:tc>
+          <w:tcPr>
+            <w:tcW w:w="5523" w:type="dxa"/>
+          </w:tcPr>
+          <w:p>
+            <w:pPr/>
+            <w:r>
+              <w:t xml:space="preserve">expo-camera</w:t>
+            </w:r>
+          </w:p>
+        </w:tc>
+      </w:tr>
+      <w:tr>
+        <w:tc>
+          <w:tcPr>
+            <w:tcW w:w="3836" w:type="dxa"/>
+          </w:tcPr>
+          <w:p>
+            <w:pPr/>
+            <w:r>
+              <w:t xml:space="preserve">Canvas (dart:ui) cho composer</w:t>
+            </w:r>
+          </w:p>
+        </w:tc>
+        <w:tc>
+          <w:tcPr>
+            <w:tcW w:w="5523" w:type="dxa"/>
+          </w:tcPr>
+          <w:p>
+            <w:pPr/>
+            <w:r>
+              <w:t xml:space="preserve">@shopify/react-native-skia, vẽ theo lớp</w:t>
+            </w:r>
+          </w:p>
+        </w:tc>
+      </w:tr>
+      <w:tr>
+        <w:tc>
+          <w:tcPr>
+            <w:tcW w:w="3836" w:type="dxa"/>
+          </w:tcPr>
+          <w:p>
+            <w:pPr/>
+            <w:r>
+              <w:t xml:space="preserve">home_widget</w:t>
+            </w:r>
+          </w:p>
+        </w:tc>
+        <w:tc>
+          <w:tcPr>
+            <w:tcW w:w="5523" w:type="dxa"/>
+          </w:tcPr>
+          <w:p>
+            <w:pPr/>
+            <w:r>
+              <w:t xml:space="preserve">App Group cùng module native nhỏ, widget do @bacons/apple-targets thêm vào</w:t>
+            </w:r>
+          </w:p>
+        </w:tc>
+      </w:tr>
+      <w:tr>
+        <w:tc>
+          <w:tcPr>
+            <w:tcW w:w="3836" w:type="dxa"/>
+          </w:tcPr>
+          <w:p>
+            <w:pPr/>
+            <w:r>
+              <w:t xml:space="preserve">Flavor dev/prod</w:t>
+            </w:r>
+          </w:p>
+        </w:tc>
+        <w:tc>
+          <w:tcPr>
+            <w:tcW w:w="5523" w:type="dxa"/>
+          </w:tcPr>
+          <w:p>
+            <w:pPr/>
+            <w:r>
+              <w:t xml:space="preserve">Profile EAS và biến APP_ENV</w:t>
+            </w:r>
+          </w:p>
+        </w:tc>
+      </w:tr>
+      <w:tr>
+        <w:tc>
+          <w:tcPr>
+            <w:tcW w:w="3836" w:type="dxa"/>
+          </w:tcPr>
+          <w:p>
+            <w:pPr/>
+            <w:r>
+              <w:t xml:space="preserve">Riverpod, go_router</w:t>
+            </w:r>
+          </w:p>
+        </w:tc>
+        <w:tc>
+          <w:tcPr>
+            <w:tcW w:w="5523" w:type="dxa"/>
+          </w:tcPr>
+          <w:p>
+            <w:pPr/>
+            <w:r>
+              <w:t xml:space="preserve">TanStack Query và Zustand, Expo Router</w:t>
+            </w:r>
+          </w:p>
+        </w:tc>
+      </w:tr>
+      <w:tr>
+        <w:tc>
+          <w:tcPr>
+            <w:tcW w:w="3836" w:type="dxa"/>
+          </w:tcPr>
+          <w:p>
+            <w:pPr/>
+            <w:r>
+              <w:t xml:space="preserve">Codemagic</w:t>
+            </w:r>
+          </w:p>
+        </w:tc>
+        <w:tc>
+          <w:tcPr>
+            <w:tcW w:w="5523" w:type="dxa"/>
+          </w:tcPr>
+          <w:p>
+            <w:pPr/>
+            <w:r>
+              <w:t xml:space="preserve">EAS Build và EAS Submit</w:t>
+            </w:r>
+          </w:p>
+        </w:tc>
+      </w:tr>
+      <w:tr>
+        <w:tc>
+          <w:tcPr>
+            <w:tcW w:w="3836" w:type="dxa"/>
+          </w:tcPr>
+          <w:p>
+            <w:pPr/>
+            <w:r>
+              <w:t xml:space="preserve">flutter analyze, flutter test</w:t>
+            </w:r>
+          </w:p>
+        </w:tc>
+        <w:tc>
+          <w:tcPr>
+            <w:tcW w:w="5523" w:type="dxa"/>
+          </w:tcPr>
+          <w:p>
+            <w:pPr/>
+            <w:r>
+              <w:t xml:space="preserve">tsc, eslint, jest</w:t>
+            </w:r>
+          </w:p>
+        </w:tc>
+      </w:tr>
+      <w:tr>
+        <w:tc>
+          <w:tcPr>
+            <w:tcW w:w="3836" w:type="dxa"/>
+          </w:tcPr>
+          <w:p>
+            <w:pPr/>
+            <w:r>
+              <w:t xml:space="preserve">main_dev.dart, main_prod.dart</w:t>
+            </w:r>
+          </w:p>
+        </w:tc>
+        <w:tc>
+          <w:tcPr>
+            <w:tcW w:w="5523" w:type="dxa"/>
+          </w:tcPr>
+          <w:p>
+            <w:pPr/>
+            <w:r>
+              <w:t xml:space="preserve">app.config.ts đọc APP_ENV</w:t>
+            </w:r>
+          </w:p>
+        </w:tc>
+      </w:tr>
+    </w:tbl>
     <w:p>
       <w:pPr>
         <w:pStyle w:val="Heading2"/>
@@ -8666,7 +8997,7 @@
           <w:p>
             <w:pPr/>
             <w:r>
-              <w:t xml:space="preserve">Flutter + Firebase</w:t>
+              <w:t xml:space="preserve">Expo (React Native) + Firebase</w:t>
             </w:r>
           </w:p>
         </w:tc>
@@ -10645,7 +10976,7 @@
           <w:p>
             <w:pPr/>
             <w:r>
-              <w:t xml:space="preserve">Thiết lập Codemagic: merge vào main thì build và đẩy lên TestFlight nội bộ</w:t>
+              <w:t xml:space="preserve">Thiết lập EAS Build và EAS Submit: merge vào main thì build và đẩy lên TestFlight nội bộ</w:t>
             </w:r>
           </w:p>
         </w:tc>
@@ -10680,7 +11011,7 @@
           <w:p>
             <w:pPr/>
             <w:r>
-              <w:t xml:space="preserve">Flavor dev/prod, CI analyze và test, theme theo design token (mục 18), router, bundle font</w:t>
+              <w:t xml:space="preserve">Profile EAS dev/prod, CI (tsc, eslint, jest), theme theo design token (mục 18), Expo Router, bundle font</w:t>
             </w:r>
           </w:p>
         </w:tc>

</xml_diff>